<commit_message>
Image generation : PlantUML + Matplotlib
</commit_message>
<xml_diff>
--- a/assets/sample.docx
+++ b/assets/sample.docx
@@ -24,7 +24,7 @@
           <w:rFonts w:ascii="Times New Roman" w:hAnsi="Times New Roman"/>
           <w:sz w:val="24"/>
         </w:rPr>
-        <w:t>This document presents an in-depth exploration of the process involved in making a project, providing a comprehensive overview of the various stages involved. By examining the technical, creative, and practical aspects of the making process, this work aims to shed light on the complexities and nuances of creating something new. Through a structured and systematic approach, the document offers insights into the skills, techniques, and tools necessary for successful implementation, serving as a valuable resource for students, practitioners, and professionals looking to develop their making skills.</w:t>
+        <w:t>The abstract provides a concise overview of the normal distribution graph creation process. This document outlines the steps to generate a normal distribution graph using statistical software, ensuring accurate representation of bell-shaped distributions that are commonly found in various fields of study. By following the methods presented, researchers and analysts can effectively visualize and work with normally distributed data, providing valuable insights into complex phenomena.</w:t>
       </w:r>
     </w:p>
     <w:p>
@@ -41,6 +41,53 @@
       </w:r>
     </w:p>
     <w:p>
+      <w:r>
+        <w:drawing>
+          <wp:inline xmlns:a="http://schemas.openxmlformats.org/drawingml/2006/main" xmlns:pic="http://schemas.openxmlformats.org/drawingml/2006/picture">
+            <wp:extent cx="5029200" cy="3352800"/>
+            <wp:docPr id="1" name="Picture 1"/>
+            <wp:cNvGraphicFramePr>
+              <a:graphicFrameLocks noChangeAspect="1"/>
+            </wp:cNvGraphicFramePr>
+            <a:graphic>
+              <a:graphicData uri="http://schemas.openxmlformats.org/drawingml/2006/picture">
+                <pic:pic>
+                  <pic:nvPicPr>
+                    <pic:cNvPr id="0" name="Introduction_chart.png"/>
+                    <pic:cNvPicPr/>
+                  </pic:nvPicPr>
+                  <pic:blipFill>
+                    <a:blip r:embed="rId9"/>
+                    <a:stretch>
+                      <a:fillRect/>
+                    </a:stretch>
+                  </pic:blipFill>
+                  <pic:spPr>
+                    <a:xfrm>
+                      <a:off x="0" y="0"/>
+                      <a:ext cx="5029200" cy="3352800"/>
+                    </a:xfrm>
+                    <a:prstGeom prst="rect"/>
+                  </pic:spPr>
+                </pic:pic>
+              </a:graphicData>
+            </a:graphic>
+          </wp:inline>
+        </w:drawing>
+      </w:r>
+    </w:p>
+    <w:p>
+      <w:pPr>
+        <w:pStyle w:val="Caption"/>
+      </w:pPr>
+      <w:r>
+        <w:rPr>
+          <w:i/>
+        </w:rPr>
+        <w:t>Fig.: Normal Distribution Curve</w:t>
+      </w:r>
+    </w:p>
+    <w:p>
       <w:pPr>
         <w:jc w:val="both"/>
       </w:pPr>
@@ -49,7 +96,7 @@
           <w:rFonts w:ascii="Times New Roman" w:hAnsi="Times New Roman"/>
           <w:sz w:val="24"/>
         </w:rPr>
-        <w:t>This section serves as an introduction to the concept of "making something", a ubiquitous human activity that encompasses a wide range of creative endeavors and practical tasks. The term "make" is often associated with crafting, production, and assembly, but its underlying principles and processes can be observed in various forms of human activity. By examining the concept of "making something", this document aims to explore the underlying dynamics and mechanics that govern this activity, highlighting its relevance in various fields and disciplines.</w:t>
+        <w:t>The normal distribution graph, also known as a bell curve, is a fundamental concept in statistics that represents the distribution of values in a dataset. It is characterized by a symmetrical, bell-shaped curve with a central peak and declining tails. The purpose of creating a normal distribution graph is to visually represent the distribution of data, identify patterns and skewness, and make informed decisions based on the data's characteristics. By understanding and interpreting normal distribution graphs, students and professionals in various fields can gain valuable insights into the underlying structure of datasets and make data-driven decisions.</w:t>
       </w:r>
     </w:p>
     <w:p>
@@ -66,6 +113,53 @@
       </w:r>
     </w:p>
     <w:p>
+      <w:r>
+        <w:drawing>
+          <wp:inline xmlns:a="http://schemas.openxmlformats.org/drawingml/2006/main" xmlns:pic="http://schemas.openxmlformats.org/drawingml/2006/picture">
+            <wp:extent cx="5029200" cy="3352800"/>
+            <wp:docPr id="2" name="Picture 2"/>
+            <wp:cNvGraphicFramePr>
+              <a:graphicFrameLocks noChangeAspect="1"/>
+            </wp:cNvGraphicFramePr>
+            <a:graphic>
+              <a:graphicData uri="http://schemas.openxmlformats.org/drawingml/2006/picture">
+                <pic:pic>
+                  <pic:nvPicPr>
+                    <pic:cNvPr id="0" name="Methodology_chart.png"/>
+                    <pic:cNvPicPr/>
+                  </pic:nvPicPr>
+                  <pic:blipFill>
+                    <a:blip r:embed="rId10"/>
+                    <a:stretch>
+                      <a:fillRect/>
+                    </a:stretch>
+                  </pic:blipFill>
+                  <pic:spPr>
+                    <a:xfrm>
+                      <a:off x="0" y="0"/>
+                      <a:ext cx="5029200" cy="3352800"/>
+                    </a:xfrm>
+                    <a:prstGeom prst="rect"/>
+                  </pic:spPr>
+                </pic:pic>
+              </a:graphicData>
+            </a:graphic>
+          </wp:inline>
+        </w:drawing>
+      </w:r>
+    </w:p>
+    <w:p>
+      <w:pPr>
+        <w:pStyle w:val="Caption"/>
+      </w:pPr>
+      <w:r>
+        <w:rPr>
+          <w:i/>
+        </w:rPr>
+        <w:t>Fig.: Normal Distribution Curve</w:t>
+      </w:r>
+    </w:p>
+    <w:p>
       <w:pPr>
         <w:jc w:val="both"/>
       </w:pPr>
@@ -74,7 +168,7 @@
           <w:rFonts w:ascii="Times New Roman" w:hAnsi="Times New Roman"/>
           <w:sz w:val="24"/>
         </w:rPr>
-        <w:t>The methodology employed to make this item involves a multi-step process. Initial preparation included sourcing and cleaning of raw materials, which were then carefully measured and combined according to established recipes. Heat treatment and processing were carried out using a combination of manual and automated equipment, with temperature and time parameters monitored closely to ensure optimal outcomes. Quality control checks were performed at multiple stages of production to prevent contamination and assure consistency in the final product.</w:t>
+        <w:t>To create a normal distribution graph, we employed a standardized approach. Initially, a random variable with a known mean (μ) and standard deviation (σ) was generated. The generated variable's values were then used to plot a histogram using a bin width that maximizes the resolution while minimizing the overlap between adjacent bins. Finally, a normal distribution curve was fitted to the histogram using a parametric method, ensuring accurate representation of the underlying data. The fitted curve served as the basis for the final normal distribution graph.</w:t>
       </w:r>
     </w:p>
     <w:p>
@@ -91,6 +185,53 @@
       </w:r>
     </w:p>
     <w:p>
+      <w:r>
+        <w:drawing>
+          <wp:inline xmlns:a="http://schemas.openxmlformats.org/drawingml/2006/main" xmlns:pic="http://schemas.openxmlformats.org/drawingml/2006/picture">
+            <wp:extent cx="5029200" cy="3352800"/>
+            <wp:docPr id="3" name="Picture 3"/>
+            <wp:cNvGraphicFramePr>
+              <a:graphicFrameLocks noChangeAspect="1"/>
+            </wp:cNvGraphicFramePr>
+            <a:graphic>
+              <a:graphicData uri="http://schemas.openxmlformats.org/drawingml/2006/picture">
+                <pic:pic>
+                  <pic:nvPicPr>
+                    <pic:cNvPr id="0" name="Results_chart.png"/>
+                    <pic:cNvPicPr/>
+                  </pic:nvPicPr>
+                  <pic:blipFill>
+                    <a:blip r:embed="rId11"/>
+                    <a:stretch>
+                      <a:fillRect/>
+                    </a:stretch>
+                  </pic:blipFill>
+                  <pic:spPr>
+                    <a:xfrm>
+                      <a:off x="0" y="0"/>
+                      <a:ext cx="5029200" cy="3352800"/>
+                    </a:xfrm>
+                    <a:prstGeom prst="rect"/>
+                  </pic:spPr>
+                </pic:pic>
+              </a:graphicData>
+            </a:graphic>
+          </wp:inline>
+        </w:drawing>
+      </w:r>
+    </w:p>
+    <w:p>
+      <w:pPr>
+        <w:pStyle w:val="Caption"/>
+      </w:pPr>
+      <w:r>
+        <w:rPr>
+          <w:i/>
+        </w:rPr>
+        <w:t>Fig.: Normal Distribution Curve</w:t>
+      </w:r>
+    </w:p>
+    <w:p>
       <w:pPr>
         <w:jc w:val="both"/>
       </w:pPr>
@@ -99,7 +240,7 @@
           <w:rFonts w:ascii="Times New Roman" w:hAnsi="Times New Roman"/>
           <w:sz w:val="24"/>
         </w:rPr>
-        <w:t>The experiment to make something consisted of four stages. In stage one, a material was selected and prepared for use. Stage two involved applying the chosen material to a surface using a specific technique. Stage three required the application of additional elements to enhance the product's characteristics. Our results showed that stage three was the most critical factor in determining the final outcome, with changes in the additional elements affecting the quality and performance of the product.</w:t>
+        <w:t>The normal distribution graph was generated using the standard Gaussian distribution function. A total of 1000 random data points were simulated, which followed a mean (μ) of 0 and a standard deviation (σ) of 1. The resulting distribution exhibited a symmetrical bell-shaped curve, characteristic of a normal distribution, with a majority of data points clustered around the mean and tapering off gradually towards the extremes.</w:t>
       </w:r>
     </w:p>
     <w:p>
@@ -124,7 +265,7 @@
           <w:rFonts w:ascii="Times New Roman" w:hAnsi="Times New Roman"/>
           <w:sz w:val="24"/>
         </w:rPr>
-        <w:t>In conclusion, this study examined the process of making something, encompassing various aspects of creation, fabrication, and assembly. Through a comprehensive analysis of existing literature and empirical research, we have gained a deeper understanding of the underlying principles, challenges, and opportunities associated with making something. The findings of this study highlight the importance of considering human factors, technological advancements, and environmental sustainability in the making process. As we move forward, it is essential to continue exploring new methods, materials, and approaches to making something, with the ultimate goal of promoting innovative solutions, improving quality of life, and minimizing our ecological footprint.</w:t>
+        <w:t>In conclusion, generating a normal distribution graph involves a straightforward process. By understanding the characteristics of a normal distribution and utilizing a statistical software or programming language such as Python or R, users can easily produce a normal distribution graph. This can be achieved by specifying the mean and standard deviation parameters, which are then used to plot the graph. The result is a clear and concise visual representation of the normal distribution, which can be useful in various fields such as statistics, data analysis, and scientific research.</w:t>
       </w:r>
     </w:p>
     <w:sectPr>

</xml_diff>